<commit_message>
docs(guide): Adresse publiée et QR code d'installation dans le guide
- Remplacement de l'emplacement « à venir » par l'adresse
  https://alicework.github.io/table-de-marque/ et son QR code
- Génération du QR code par npm run guide, à partir de l'adresse
  indiquée dans le guide, avant celle du document Word
- Adresse reprise en couverture du Word, mention de la connexion
  nécessaire à la première ouverture
</commit_message>
<xml_diff>
--- a/docs/guide-utilisation.docx
+++ b/docs/guide-utilisation.docx
@@ -25,7 +25,7 @@
                     </pic:cNvPicPr>
                   </pic:nvPicPr>
                   <pic:blipFill>
-                    <a:blip r:embed="rId9" cstate="none"/>
+                    <a:blip r:embed="rId11" cstate="none"/>
                     <a:srcRect/>
                     <a:stretch>
                       <a:fillRect/>
@@ -179,6 +179,22 @@
       </w:r>
     </w:p>
     <w:p>
+      <w:pPr>
+        <w:spacing w:before="80"/>
+      </w:pPr>
+      <w:hyperlink w:history="1" r:id="rIdnv4kbt0fu4hw7cwexeyba">
+        <w:r>
+          <w:rPr>
+            <w:color w:val="A8420C"/>
+            <w:sz w:val="20"/>
+            <w:szCs w:val="20"/>
+            <w:u w:val="single"/>
+          </w:rPr>
+          <w:t xml:space="preserve">alicework.github.io/table-de-marque/</w:t>
+        </w:r>
+      </w:hyperlink>
+    </w:p>
+    <w:p>
       <w:r>
         <w:br w:type="page"/>
       </w:r>
@@ -387,75 +403,55 @@
       </w:r>
       <w:bookmarkEnd w:id="2"/>
     </w:p>
-    <w:tbl>
-      <w:tblPr>
-        <w:tblW w:type="dxa" w:w="3400"/>
+    <w:p>
+      <w:pPr>
+        <w:spacing w:after="0" w:before="120"/>
         <w:jc w:val="center"/>
-        <w:tblBorders>
-          <w:top w:val="single" w:color="auto" w:sz="4"/>
-          <w:left w:val="single" w:color="auto" w:sz="4"/>
-          <w:bottom w:val="single" w:color="auto" w:sz="4"/>
-          <w:right w:val="single" w:color="auto" w:sz="4"/>
-          <w:insideH w:val="single" w:color="auto" w:sz="4"/>
-          <w:insideV w:val="single" w:color="auto" w:sz="4"/>
-        </w:tblBorders>
-        <w:tblLayout w:type="fixed"/>
-      </w:tblPr>
-      <w:tblGrid>
-        <w:gridCol w:w="3400"/>
-      </w:tblGrid>
-      <w:tr>
-        <w:trPr>
-          <w:trHeight w:val="3400" w:hRule="exact"/>
-        </w:trPr>
-        <w:tc>
-          <w:tcPr>
-            <w:tcW w:type="dxa" w:w="3400"/>
-            <w:tcBorders>
-              <w:top w:val="dashed" w:color="C24F12" w:sz="12"/>
-              <w:left w:val="dashed" w:color="C24F12" w:sz="12"/>
-              <w:bottom w:val="dashed" w:color="C24F12" w:sz="12"/>
-              <w:right w:val="dashed" w:color="C24F12" w:sz="12"/>
-            </w:tcBorders>
-            <w:shd w:fill="FFFFFF" w:color="auto" w:val="clear"/>
-            <w:vAlign w:val="center"/>
-          </w:tcPr>
-          <w:p>
-            <w:pPr>
-              <w:spacing w:after="80"/>
-              <w:jc w:val="center"/>
-            </w:pPr>
-            <w:r>
-              <w:rPr>
-                <w:rFonts w:ascii="Manrope ExtraBold" w:cs="Manrope ExtraBold" w:eastAsia="Manrope ExtraBold" w:hAnsi="Manrope ExtraBold"/>
-                <w:color w:val="A8420C"/>
-                <w:sz w:val="26"/>
-                <w:szCs w:val="26"/>
-              </w:rPr>
-              <w:t xml:space="preserve">QR code à venir</w:t>
-            </w:r>
-          </w:p>
-          <w:p>
-            <w:pPr>
-              <w:jc w:val="center"/>
-            </w:pPr>
-            <w:r>
-              <w:rPr>
-                <w:i/>
-                <w:iCs/>
-                <w:color w:val="66645E"/>
-                <w:sz w:val="18"/>
-                <w:szCs w:val="18"/>
-              </w:rPr>
-              <w:t xml:space="preserve">Disponible dès la mise en ligne</w:t>
-            </w:r>
-          </w:p>
-        </w:tc>
-      </w:tr>
-    </w:tbl>
-    <w:p>
-      <w:pPr>
-        <w:spacing w:after="240" w:before="160"/>
+      </w:pPr>
+      <w:r>
+        <w:drawing>
+          <wp:inline distT="0" distB="0" distL="0" distR="0">
+            <wp:extent cx="1619250" cy="1619250"/>
+            <wp:effectExtent t="0" r="0" b="0" l="0"/>
+            <wp:docPr id="2" name="" descr="" title=""/>
+            <wp:cNvGraphicFramePr>
+              <a:graphicFrameLocks xmlns:a="http://schemas.openxmlformats.org/drawingml/2006/main" noChangeAspect="1"/>
+            </wp:cNvGraphicFramePr>
+            <a:graphic xmlns:a="http://schemas.openxmlformats.org/drawingml/2006/main">
+              <a:graphicData uri="http://schemas.openxmlformats.org/drawingml/2006/picture">
+                <pic:pic xmlns:pic="http://schemas.openxmlformats.org/drawingml/2006/picture">
+                  <pic:nvPicPr>
+                    <pic:cNvPr id="0" name="" descr=""/>
+                    <pic:cNvPicPr>
+                      <a:picLocks noChangeAspect="1" noChangeArrowheads="1"/>
+                    </pic:cNvPicPr>
+                  </pic:nvPicPr>
+                  <pic:blipFill>
+                    <a:blip r:embed="rId12" cstate="none"/>
+                    <a:srcRect/>
+                    <a:stretch>
+                      <a:fillRect/>
+                    </a:stretch>
+                  </pic:blipFill>
+                  <pic:spPr bwMode="auto">
+                    <a:xfrm>
+                      <a:off x="0" y="0"/>
+                      <a:ext cx="1619250" cy="1619250"/>
+                    </a:xfrm>
+                    <a:prstGeom prst="rect">
+                      <a:avLst/>
+                    </a:prstGeom>
+                  </pic:spPr>
+                </pic:pic>
+              </a:graphicData>
+            </a:graphic>
+          </wp:inline>
+        </w:drawing>
+      </w:r>
+    </w:p>
+    <w:p>
+      <w:pPr>
+        <w:spacing w:after="240" w:before="60"/>
         <w:jc w:val="center"/>
       </w:pPr>
       <w:r>
@@ -464,23 +460,24 @@
         </w:rPr>
         <w:t xml:space="preserve">Adresse : </w:t>
       </w:r>
-      <w:r>
-        <w:rPr>
-          <w:b/>
-          <w:bCs/>
-          <w:i/>
-          <w:iCs/>
-          <w:color w:val="1D1C1A"/>
-        </w:rPr>
-        <w:t xml:space="preserve">adresse à venir</w:t>
-      </w:r>
+      <w:hyperlink w:history="1" r:id="rIdkh1awtpy3nybtvpm1lq2h">
+        <w:r>
+          <w:rPr>
+            <w:b/>
+            <w:bCs/>
+            <w:color w:val="A8420C"/>
+            <w:u w:val="single"/>
+          </w:rPr>
+          <w:t xml:space="preserve">https://alicework.github.io/table-de-marque/</w:t>
+        </w:r>
+      </w:hyperlink>
     </w:p>
     <w:p>
       <w:pPr>
         <w:spacing w:after="140"/>
       </w:pPr>
       <w:r>
-        <w:t xml:space="preserve">Scannez le QR code avec l'appareil photo du téléphone ou de la tablette, puis installez l'application sur l'écran d'accueil :</w:t>
+        <w:t xml:space="preserve">Scannez le QR code avec l'appareil photo du téléphone ou de la tablette, ou saisissez l'adresse dans le navigateur. Installez ensuite l'application sur l'écran d'accueil :</w:t>
       </w:r>
     </w:p>
     <w:tbl>
@@ -896,7 +893,7 @@
         <w:spacing w:after="140"/>
       </w:pPr>
       <w:r>
-        <w:t xml:space="preserve">Une fois installée, l'application s'ouvre comme une application classique, en plein écran, et </w:t>
+        <w:t xml:space="preserve">La première ouverture demande une connexion internet. Une fois installée, l'application s'ouvre comme une application classique, en plein écran, et </w:t>
       </w:r>
       <w:r>
         <w:rPr>

</xml_diff>

<commit_message>
fix(clubs): Remplacement du nom Webaffiligue par LigueAsso
- Libellés de l'import, messages d'erreur et commentaires renommés
  (identifiants internes inchangés)
- Guide : export depuis Statistiques et Extractions → Extractions →
  Extraction adhérents, document Word régénéré
- Tests unitaires et e2e alignés sur les nouveaux libellés
</commit_message>
<xml_diff>
--- a/docs/guide-utilisation.docx
+++ b/docs/guide-utilisation.docx
@@ -182,7 +182,7 @@
       <w:pPr>
         <w:spacing w:before="80"/>
       </w:pPr>
-      <w:hyperlink w:history="1" r:id="rIdnv4kbt0fu4hw7cwexeyba">
+      <w:hyperlink w:history="1" r:id="rIdyrpncvazsnurfpjgsk4bq">
         <w:r>
           <w:rPr>
             <w:color w:val="A8420C"/>
@@ -460,7 +460,7 @@
         </w:rPr>
         <w:t xml:space="preserve">Adresse : </w:t>
       </w:r>
-      <w:hyperlink w:history="1" r:id="rIdkh1awtpy3nybtvpm1lq2h">
+      <w:hyperlink w:history="1" r:id="rIdxcykhuhewzchjrubddfjk">
         <w:r>
           <w:rPr>
             <w:b/>
@@ -1059,7 +1059,7 @@
         <w:t xml:space="preserve">Recommandé</w:t>
       </w:r>
       <w:r>
-        <w:t xml:space="preserve"> : importer l'export Webaffiligue (tous les licenciés d'un coup) ;</w:t>
+        <w:t xml:space="preserve"> : importer l'export LigueAsso (tous les licenciés d'un coup) ;</w:t>
       </w:r>
     </w:p>
     <w:p>
@@ -1080,7 +1080,7 @@
         <w:pStyle w:val="Heading2"/>
       </w:pPr>
       <w:r>
-        <w:t xml:space="preserve">2.1 Récupérer l'export Webaffiligue</w:t>
+        <w:t xml:space="preserve">2.1 Récupérer l'export LigueAsso</w:t>
       </w:r>
     </w:p>
     <w:p>
@@ -1101,7 +1101,7 @@
           <w:bCs/>
           <w:color w:val="A8420C"/>
         </w:rPr>
-        <w:t xml:space="preserve">Webaffiligue</w:t>
+        <w:t xml:space="preserve">LigueAsso</w:t>
       </w:r>
       <w:r>
         <w:t xml:space="preserve"> avec le compte de l'association.</w:t>
@@ -1117,6 +1117,52 @@
         <w:spacing w:after="80"/>
       </w:pPr>
       <w:r>
+        <w:t xml:space="preserve">Ouvrez le menu </w:t>
+      </w:r>
+      <w:r>
+        <w:rPr>
+          <w:b/>
+          <w:bCs/>
+          <w:color w:val="A8420C"/>
+        </w:rPr>
+        <w:t xml:space="preserve">Statistiques et Extractions</w:t>
+      </w:r>
+      <w:r>
+        <w:t xml:space="preserve"> → </w:t>
+      </w:r>
+      <w:r>
+        <w:rPr>
+          <w:b/>
+          <w:bCs/>
+          <w:color w:val="A8420C"/>
+        </w:rPr>
+        <w:t xml:space="preserve">Extractions</w:t>
+      </w:r>
+      <w:r>
+        <w:t xml:space="preserve"> → </w:t>
+      </w:r>
+      <w:r>
+        <w:rPr>
+          <w:b/>
+          <w:bCs/>
+          <w:color w:val="A8420C"/>
+        </w:rPr>
+        <w:t xml:space="preserve">Extraction adhérents</w:t>
+      </w:r>
+      <w:r>
+        <w:t xml:space="preserve">.</w:t>
+      </w:r>
+    </w:p>
+    <w:p>
+      <w:pPr>
+        <w:pStyle w:val="ListParagraph"/>
+        <w:numPr>
+          <w:ilvl w:val="0"/>
+          <w:numId w:val="4"/>
+        </w:numPr>
+        <w:spacing w:after="80"/>
+      </w:pPr>
+      <w:r>
         <w:t xml:space="preserve">Exportez la liste des adhérents au format </w:t>
       </w:r>
       <w:r>
@@ -1128,7 +1174,7 @@
         <w:t xml:space="preserve">CSV</w:t>
       </w:r>
       <w:r>
-        <w:t xml:space="preserve"> (export « Sortie simple »).</w:t>
+        <w:t xml:space="preserve">.</w:t>
       </w:r>
     </w:p>
     <w:p>
@@ -1693,7 +1739,7 @@
           <w:bCs/>
           <w:color w:val="A8420C"/>
         </w:rPr>
-        <w:t xml:space="preserve">Importer un export Webaffiligue</w:t>
+        <w:t xml:space="preserve">Importer un export LigueAsso</w:t>
       </w:r>
       <w:r>
         <w:t xml:space="preserve"> et choisissez le fichier CSV.</w:t>
@@ -1888,7 +1934,7 @@
         <w:spacing w:after="140"/>
       </w:pPr>
       <w:r>
-        <w:t xml:space="preserve">Sans accès à Webaffiligue :</w:t>
+        <w:t xml:space="preserve">Sans accès à LigueAsso :</w:t>
       </w:r>
     </w:p>
     <w:p>
@@ -2036,7 +2082,7 @@
                 <w:sz w:val="20"/>
                 <w:szCs w:val="20"/>
               </w:rPr>
-              <w:t xml:space="preserve">Vous pourrez importer un export Webaffiligue plus tard : un club créé à la main n'ayant pas de n° d'association, l'import créera un second club. Supprimez alors le club saisi à la main.</w:t>
+              <w:t xml:space="preserve">Vous pourrez importer un export LigueAsso plus tard : un club créé à la main n'ayant pas de n° d'association, l'import créera un second club. Supprimez alors le club saisi à la main.</w:t>
             </w:r>
           </w:p>
         </w:tc>
@@ -4994,7 +5040,7 @@
         <w:spacing w:after="140"/>
       </w:pPr>
       <w:r>
-        <w:t xml:space="preserve">Refaites simplement un import (section 2.2) avec un export Webaffiligue récent :</w:t>
+        <w:t xml:space="preserve">Refaites simplement un import (section 2.2) avec un export LigueAsso récent :</w:t>
       </w:r>
     </w:p>
     <w:p>
@@ -5248,7 +5294,7 @@
         <w:t xml:space="preserve">Mauvais fichier</w:t>
       </w:r>
       <w:r>
-        <w:t xml:space="preserve"> — Si l'export Webaffiligue est donné par erreur à </w:t>
+        <w:t xml:space="preserve"> — Si l'export LigueAsso est donné par erreur à </w:t>
       </w:r>
       <w:r>
         <w:rPr>

</xml_diff>

<commit_message>
feat(clubs): Lien direct vers l'extraction des adhérents LiguAsso
- Encart sur l'écran Clubs et licenciés : chemin du menu et bouton
  ouvrant l'extraction dans un nouvel onglet (le menu de LiguAsso ne
  s'ouvre pas sous Firefox)
- Correction de la graphie : LiguAsso, et non LigueAsso
- Guide : lien direct dans l'étape d'export, liens externes rendus
  cliquables dans le document Word
</commit_message>
<xml_diff>
--- a/docs/guide-utilisation.docx
+++ b/docs/guide-utilisation.docx
@@ -12,408 +12,6 @@
             <wp:extent cx="914400" cy="914400"/>
             <wp:effectExtent t="0" r="0" b="0" l="0"/>
             <wp:docPr id="1" name="" descr="" title=""/>
-            <wp:cNvGraphicFramePr>
-              <a:graphicFrameLocks xmlns:a="http://schemas.openxmlformats.org/drawingml/2006/main" noChangeAspect="1"/>
-            </wp:cNvGraphicFramePr>
-            <a:graphic xmlns:a="http://schemas.openxmlformats.org/drawingml/2006/main">
-              <a:graphicData uri="http://schemas.openxmlformats.org/drawingml/2006/picture">
-                <pic:pic xmlns:pic="http://schemas.openxmlformats.org/drawingml/2006/picture">
-                  <pic:nvPicPr>
-                    <pic:cNvPr id="0" name="" descr=""/>
-                    <pic:cNvPicPr>
-                      <a:picLocks noChangeAspect="1" noChangeArrowheads="1"/>
-                    </pic:cNvPicPr>
-                  </pic:nvPicPr>
-                  <pic:blipFill>
-                    <a:blip r:embed="rId11" cstate="none"/>
-                    <a:srcRect/>
-                    <a:stretch>
-                      <a:fillRect/>
-                    </a:stretch>
-                  </pic:blipFill>
-                  <pic:spPr bwMode="auto">
-                    <a:xfrm>
-                      <a:off x="0" y="0"/>
-                      <a:ext cx="914400" cy="914400"/>
-                    </a:xfrm>
-                    <a:prstGeom prst="rect">
-                      <a:avLst/>
-                    </a:prstGeom>
-                  </pic:spPr>
-                </pic:pic>
-              </a:graphicData>
-            </a:graphic>
-          </wp:inline>
-        </w:drawing>
-      </w:r>
-    </w:p>
-    <w:p>
-      <w:pPr>
-        <w:spacing w:after="60"/>
-      </w:pPr>
-      <w:r>
-        <w:rPr>
-          <w:rFonts w:ascii="Manrope ExtraBold" w:cs="Manrope ExtraBold" w:eastAsia="Manrope ExtraBold" w:hAnsi="Manrope ExtraBold"/>
-          <w:color w:val="1D1C1A"/>
-          <w:sz w:val="72"/>
-          <w:szCs w:val="72"/>
-        </w:rPr>
-        <w:t xml:space="preserve">Table de marque</w:t>
-      </w:r>
-    </w:p>
-    <w:p>
-      <w:pPr>
-        <w:spacing w:after="480"/>
-      </w:pPr>
-      <w:r>
-        <w:rPr>
-          <w:b/>
-          <w:bCs/>
-          <w:color w:val="66645E"/>
-          <w:sz w:val="28"/>
-          <w:szCs w:val="28"/>
-        </w:rPr>
-        <w:t xml:space="preserve">Basket loisir UFOLEP 33</w:t>
-      </w:r>
-    </w:p>
-    <w:p>
-      <w:pPr>
-        <w:pBdr>
-          <w:left w:val="single" w:color="C24F12" w:sz="36" w:space="12"/>
-        </w:pBdr>
-        <w:spacing w:after="360"/>
-      </w:pPr>
-      <w:r>
-        <w:rPr>
-          <w:rFonts w:ascii="Manrope ExtraBold" w:cs="Manrope ExtraBold" w:eastAsia="Manrope ExtraBold" w:hAnsi="Manrope ExtraBold"/>
-          <w:color w:val="A8420C"/>
-          <w:sz w:val="40"/>
-          <w:szCs w:val="40"/>
-        </w:rPr>
-        <w:t xml:space="preserve">Guide d'utilisation</w:t>
-      </w:r>
-    </w:p>
-    <w:p>
-      <w:pPr>
-        <w:spacing w:after="160" w:line="320"/>
-      </w:pPr>
-      <w:r>
-        <w:rPr>
-          <w:color w:val="1D1C1A"/>
-          <w:sz w:val="23"/>
-          <w:szCs w:val="23"/>
-        </w:rPr>
-        <w:t xml:space="preserve">Feuille de match numérique du </w:t>
-      </w:r>
-      <w:r>
-        <w:rPr>
-          <w:b/>
-          <w:bCs/>
-          <w:color w:val="A8420C"/>
-          <w:sz w:val="23"/>
-          <w:szCs w:val="23"/>
-        </w:rPr>
-        <w:t xml:space="preserve">basket loisir UFOLEP 33</w:t>
-      </w:r>
-      <w:r>
-        <w:rPr>
-          <w:color w:val="1D1C1A"/>
-          <w:sz w:val="23"/>
-          <w:szCs w:val="23"/>
-        </w:rPr>
-        <w:t xml:space="preserve">. L'application remplace la feuille papier à la table de marque : score, fautes personnelles et d'équipe, temps morts, périodes, flèche de possession.</w:t>
-      </w:r>
-    </w:p>
-    <w:p>
-      <w:pPr>
-        <w:spacing w:after="160" w:line="320"/>
-      </w:pPr>
-      <w:r>
-        <w:rPr>
-          <w:color w:val="1D1C1A"/>
-          <w:sz w:val="23"/>
-          <w:szCs w:val="23"/>
-        </w:rPr>
-        <w:t xml:space="preserve">Elle fonctionne sur téléphone et sur tablette, </w:t>
-      </w:r>
-      <w:r>
-        <w:rPr>
-          <w:b/>
-          <w:bCs/>
-          <w:color w:val="A8420C"/>
-          <w:sz w:val="23"/>
-          <w:szCs w:val="23"/>
-        </w:rPr>
-        <w:t xml:space="preserve">sans connexion internet</w:t>
-      </w:r>
-      <w:r>
-        <w:rPr>
-          <w:color w:val="1D1C1A"/>
-          <w:sz w:val="23"/>
-          <w:szCs w:val="23"/>
-        </w:rPr>
-        <w:t xml:space="preserve"> une fois installée.</w:t>
-      </w:r>
-    </w:p>
-    <w:p>
-      <w:pPr>
-        <w:spacing w:before="2400"/>
-      </w:pPr>
-      <w:r>
-        <w:rPr>
-          <w:b/>
-          <w:bCs/>
-          <w:color w:val="A8420C"/>
-          <w:sz w:val="20"/>
-          <w:szCs w:val="20"/>
-        </w:rPr>
-        <w:t xml:space="preserve">Saison 2025-2026</w:t>
-      </w:r>
-      <w:r>
-        <w:rPr>
-          <w:color w:val="66645E"/>
-          <w:sz w:val="20"/>
-          <w:szCs w:val="20"/>
-        </w:rPr>
-        <w:t xml:space="preserve">  ·  Téléphone et tablette  ·  Fonctionne hors connexion</w:t>
-      </w:r>
-    </w:p>
-    <w:p>
-      <w:pPr>
-        <w:spacing w:before="80"/>
-      </w:pPr>
-      <w:hyperlink w:history="1" r:id="rIdyrpncvazsnurfpjgsk4bq">
-        <w:r>
-          <w:rPr>
-            <w:color w:val="A8420C"/>
-            <w:sz w:val="20"/>
-            <w:szCs w:val="20"/>
-            <w:u w:val="single"/>
-          </w:rPr>
-          <w:t xml:space="preserve">alicework.github.io/table-de-marque/</w:t>
-        </w:r>
-      </w:hyperlink>
-    </w:p>
-    <w:p>
-      <w:r>
-        <w:br w:type="page"/>
-      </w:r>
-    </w:p>
-    <w:p>
-      <w:pPr>
-        <w:pStyle w:val="Heading1"/>
-        <w:tabs>
-          <w:tab w:val="left" w:pos="560"/>
-        </w:tabs>
-      </w:pPr>
-      <w:bookmarkStart w:name="section0" w:id="1"/>
-      <w:r>
-        <w:t xml:space="preserve">Sommaire</w:t>
-      </w:r>
-      <w:bookmarkEnd w:id="1"/>
-    </w:p>
-    <w:p>
-      <w:pPr>
-        <w:pStyle w:val="ListParagraph"/>
-        <w:numPr>
-          <w:ilvl w:val="0"/>
-          <w:numId w:val="2"/>
-        </w:numPr>
-        <w:spacing w:after="80"/>
-      </w:pPr>
-      <w:hyperlink w:history="1" w:anchor="section1">
-        <w:r>
-          <w:rPr>
-            <w:color w:val="A8420C"/>
-            <w:u w:val="single"/>
-          </w:rPr>
-          <w:t xml:space="preserve">Installer l'application</w:t>
-        </w:r>
-      </w:hyperlink>
-    </w:p>
-    <w:p>
-      <w:pPr>
-        <w:pStyle w:val="ListParagraph"/>
-        <w:numPr>
-          <w:ilvl w:val="0"/>
-          <w:numId w:val="2"/>
-        </w:numPr>
-        <w:spacing w:after="80"/>
-      </w:pPr>
-      <w:hyperlink w:history="1" w:anchor="section2">
-        <w:r>
-          <w:rPr>
-            <w:color w:val="A8420C"/>
-            <w:u w:val="single"/>
-          </w:rPr>
-          <w:t xml:space="preserve">Première utilisation : préparer son club</w:t>
-        </w:r>
-      </w:hyperlink>
-    </w:p>
-    <w:p>
-      <w:pPr>
-        <w:pStyle w:val="ListParagraph"/>
-        <w:numPr>
-          <w:ilvl w:val="0"/>
-          <w:numId w:val="2"/>
-        </w:numPr>
-        <w:spacing w:after="80"/>
-      </w:pPr>
-      <w:hyperlink w:history="1" w:anchor="section3">
-        <w:r>
-          <w:rPr>
-            <w:color w:val="A8420C"/>
-            <w:u w:val="single"/>
-          </w:rPr>
-          <w:t xml:space="preserve">Préparer un match</w:t>
-        </w:r>
-      </w:hyperlink>
-    </w:p>
-    <w:p>
-      <w:pPr>
-        <w:pStyle w:val="ListParagraph"/>
-        <w:numPr>
-          <w:ilvl w:val="0"/>
-          <w:numId w:val="2"/>
-        </w:numPr>
-        <w:spacing w:after="80"/>
-      </w:pPr>
-      <w:hyperlink w:history="1" w:anchor="section4">
-        <w:r>
-          <w:rPr>
-            <w:color w:val="A8420C"/>
-            <w:u w:val="single"/>
-          </w:rPr>
-          <w:t xml:space="preserve">Tenir la table de marque</w:t>
-        </w:r>
-      </w:hyperlink>
-    </w:p>
-    <w:p>
-      <w:pPr>
-        <w:pStyle w:val="ListParagraph"/>
-        <w:numPr>
-          <w:ilvl w:val="0"/>
-          <w:numId w:val="2"/>
-        </w:numPr>
-        <w:spacing w:after="80"/>
-      </w:pPr>
-      <w:hyperlink w:history="1" w:anchor="section5">
-        <w:r>
-          <w:rPr>
-            <w:color w:val="A8420C"/>
-            <w:u w:val="single"/>
-          </w:rPr>
-          <w:t xml:space="preserve">Corriger une erreur : le journal</w:t>
-        </w:r>
-      </w:hyperlink>
-    </w:p>
-    <w:p>
-      <w:pPr>
-        <w:pStyle w:val="ListParagraph"/>
-        <w:numPr>
-          <w:ilvl w:val="0"/>
-          <w:numId w:val="2"/>
-        </w:numPr>
-        <w:spacing w:after="80"/>
-      </w:pPr>
-      <w:hyperlink w:history="1" w:anchor="section6">
-        <w:r>
-          <w:rPr>
-            <w:color w:val="A8420C"/>
-            <w:u w:val="single"/>
-          </w:rPr>
-          <w:t xml:space="preserve">Fin de période et fin de match</w:t>
-        </w:r>
-      </w:hyperlink>
-    </w:p>
-    <w:p>
-      <w:pPr>
-        <w:pStyle w:val="ListParagraph"/>
-        <w:numPr>
-          <w:ilvl w:val="0"/>
-          <w:numId w:val="2"/>
-        </w:numPr>
-        <w:spacing w:after="80"/>
-      </w:pPr>
-      <w:hyperlink w:history="1" w:anchor="section7">
-        <w:r>
-          <w:rPr>
-            <w:color w:val="A8420C"/>
-            <w:u w:val="single"/>
-          </w:rPr>
-          <w:t xml:space="preserve">Partager une équipe avant le match</w:t>
-        </w:r>
-      </w:hyperlink>
-    </w:p>
-    <w:p>
-      <w:pPr>
-        <w:pStyle w:val="ListParagraph"/>
-        <w:numPr>
-          <w:ilvl w:val="0"/>
-          <w:numId w:val="2"/>
-        </w:numPr>
-        <w:spacing w:after="80"/>
-      </w:pPr>
-      <w:hyperlink w:history="1" w:anchor="section8">
-        <w:r>
-          <w:rPr>
-            <w:color w:val="A8420C"/>
-            <w:u w:val="single"/>
-          </w:rPr>
-          <w:t xml:space="preserve">Mettre à jour les licenciés en cours de saison</w:t>
-        </w:r>
-      </w:hyperlink>
-    </w:p>
-    <w:p>
-      <w:pPr>
-        <w:pStyle w:val="ListParagraph"/>
-        <w:numPr>
-          <w:ilvl w:val="0"/>
-          <w:numId w:val="2"/>
-        </w:numPr>
-        <w:spacing w:after="80"/>
-      </w:pPr>
-      <w:hyperlink w:history="1" w:anchor="section9">
-        <w:r>
-          <w:rPr>
-            <w:color w:val="A8420C"/>
-            <w:u w:val="single"/>
-          </w:rPr>
-          <w:t xml:space="preserve">Bon à savoir</w:t>
-        </w:r>
-      </w:hyperlink>
-    </w:p>
-    <w:p>
-      <w:pPr>
-        <w:pStyle w:val="Heading1"/>
-        <w:tabs>
-          <w:tab w:val="left" w:pos="560"/>
-        </w:tabs>
-      </w:pPr>
-      <w:bookmarkStart w:name="section1" w:id="2"/>
-      <w:r>
-        <w:rPr>
-          <w:rFonts w:ascii="Manrope ExtraBold" w:cs="Manrope ExtraBold" w:eastAsia="Manrope ExtraBold" w:hAnsi="Manrope ExtraBold"/>
-          <w:color w:val="C24F12"/>
-        </w:rPr>
-        <w:t xml:space="preserve">1</w:t>
-      </w:r>
-      <w:r>
-        <w:t xml:space="preserve">	Installer l'application</w:t>
-      </w:r>
-      <w:bookmarkEnd w:id="2"/>
-    </w:p>
-    <w:p>
-      <w:pPr>
-        <w:spacing w:after="0" w:before="120"/>
-        <w:jc w:val="center"/>
-      </w:pPr>
-      <w:r>
-        <w:drawing>
-          <wp:inline distT="0" distB="0" distL="0" distR="0">
-            <wp:extent cx="1619250" cy="1619250"/>
-            <wp:effectExtent t="0" r="0" b="0" l="0"/>
-            <wp:docPr id="2" name="" descr="" title=""/>
             <wp:cNvGraphicFramePr>
               <a:graphicFrameLocks xmlns:a="http://schemas.openxmlformats.org/drawingml/2006/main" noChangeAspect="1"/>
             </wp:cNvGraphicFramePr>
@@ -436,6 +34,408 @@
                   <pic:spPr bwMode="auto">
                     <a:xfrm>
                       <a:off x="0" y="0"/>
+                      <a:ext cx="914400" cy="914400"/>
+                    </a:xfrm>
+                    <a:prstGeom prst="rect">
+                      <a:avLst/>
+                    </a:prstGeom>
+                  </pic:spPr>
+                </pic:pic>
+              </a:graphicData>
+            </a:graphic>
+          </wp:inline>
+        </w:drawing>
+      </w:r>
+    </w:p>
+    <w:p>
+      <w:pPr>
+        <w:spacing w:after="60"/>
+      </w:pPr>
+      <w:r>
+        <w:rPr>
+          <w:rFonts w:ascii="Manrope ExtraBold" w:cs="Manrope ExtraBold" w:eastAsia="Manrope ExtraBold" w:hAnsi="Manrope ExtraBold"/>
+          <w:color w:val="1D1C1A"/>
+          <w:sz w:val="72"/>
+          <w:szCs w:val="72"/>
+        </w:rPr>
+        <w:t xml:space="preserve">Table de marque</w:t>
+      </w:r>
+    </w:p>
+    <w:p>
+      <w:pPr>
+        <w:spacing w:after="480"/>
+      </w:pPr>
+      <w:r>
+        <w:rPr>
+          <w:b/>
+          <w:bCs/>
+          <w:color w:val="66645E"/>
+          <w:sz w:val="28"/>
+          <w:szCs w:val="28"/>
+        </w:rPr>
+        <w:t xml:space="preserve">Basket loisir UFOLEP 33</w:t>
+      </w:r>
+    </w:p>
+    <w:p>
+      <w:pPr>
+        <w:pBdr>
+          <w:left w:val="single" w:color="C24F12" w:sz="36" w:space="12"/>
+        </w:pBdr>
+        <w:spacing w:after="360"/>
+      </w:pPr>
+      <w:r>
+        <w:rPr>
+          <w:rFonts w:ascii="Manrope ExtraBold" w:cs="Manrope ExtraBold" w:eastAsia="Manrope ExtraBold" w:hAnsi="Manrope ExtraBold"/>
+          <w:color w:val="A8420C"/>
+          <w:sz w:val="40"/>
+          <w:szCs w:val="40"/>
+        </w:rPr>
+        <w:t xml:space="preserve">Guide d'utilisation</w:t>
+      </w:r>
+    </w:p>
+    <w:p>
+      <w:pPr>
+        <w:spacing w:after="160" w:line="320"/>
+      </w:pPr>
+      <w:r>
+        <w:rPr>
+          <w:color w:val="1D1C1A"/>
+          <w:sz w:val="23"/>
+          <w:szCs w:val="23"/>
+        </w:rPr>
+        <w:t xml:space="preserve">Feuille de match numérique du </w:t>
+      </w:r>
+      <w:r>
+        <w:rPr>
+          <w:b/>
+          <w:bCs/>
+          <w:color w:val="A8420C"/>
+          <w:sz w:val="23"/>
+          <w:szCs w:val="23"/>
+        </w:rPr>
+        <w:t xml:space="preserve">basket loisir UFOLEP 33</w:t>
+      </w:r>
+      <w:r>
+        <w:rPr>
+          <w:color w:val="1D1C1A"/>
+          <w:sz w:val="23"/>
+          <w:szCs w:val="23"/>
+        </w:rPr>
+        <w:t xml:space="preserve">. L'application remplace la feuille papier à la table de marque : score, fautes personnelles et d'équipe, temps morts, périodes, flèche de possession.</w:t>
+      </w:r>
+    </w:p>
+    <w:p>
+      <w:pPr>
+        <w:spacing w:after="160" w:line="320"/>
+      </w:pPr>
+      <w:r>
+        <w:rPr>
+          <w:color w:val="1D1C1A"/>
+          <w:sz w:val="23"/>
+          <w:szCs w:val="23"/>
+        </w:rPr>
+        <w:t xml:space="preserve">Elle fonctionne sur téléphone et sur tablette, </w:t>
+      </w:r>
+      <w:r>
+        <w:rPr>
+          <w:b/>
+          <w:bCs/>
+          <w:color w:val="A8420C"/>
+          <w:sz w:val="23"/>
+          <w:szCs w:val="23"/>
+        </w:rPr>
+        <w:t xml:space="preserve">sans connexion internet</w:t>
+      </w:r>
+      <w:r>
+        <w:rPr>
+          <w:color w:val="1D1C1A"/>
+          <w:sz w:val="23"/>
+          <w:szCs w:val="23"/>
+        </w:rPr>
+        <w:t xml:space="preserve"> une fois installée.</w:t>
+      </w:r>
+    </w:p>
+    <w:p>
+      <w:pPr>
+        <w:spacing w:before="2400"/>
+      </w:pPr>
+      <w:r>
+        <w:rPr>
+          <w:b/>
+          <w:bCs/>
+          <w:color w:val="A8420C"/>
+          <w:sz w:val="20"/>
+          <w:szCs w:val="20"/>
+        </w:rPr>
+        <w:t xml:space="preserve">Saison 2025-2026</w:t>
+      </w:r>
+      <w:r>
+        <w:rPr>
+          <w:color w:val="66645E"/>
+          <w:sz w:val="20"/>
+          <w:szCs w:val="20"/>
+        </w:rPr>
+        <w:t xml:space="preserve">  ·  Téléphone et tablette  ·  Fonctionne hors connexion</w:t>
+      </w:r>
+    </w:p>
+    <w:p>
+      <w:pPr>
+        <w:spacing w:before="80"/>
+      </w:pPr>
+      <w:hyperlink w:history="1" r:id="rId_n6mjjkqs5ayl71_8a612">
+        <w:r>
+          <w:rPr>
+            <w:color w:val="A8420C"/>
+            <w:sz w:val="20"/>
+            <w:szCs w:val="20"/>
+            <w:u w:val="single"/>
+          </w:rPr>
+          <w:t xml:space="preserve">alicework.github.io/table-de-marque/</w:t>
+        </w:r>
+      </w:hyperlink>
+    </w:p>
+    <w:p>
+      <w:r>
+        <w:br w:type="page"/>
+      </w:r>
+    </w:p>
+    <w:p>
+      <w:pPr>
+        <w:pStyle w:val="Heading1"/>
+        <w:tabs>
+          <w:tab w:val="left" w:pos="560"/>
+        </w:tabs>
+      </w:pPr>
+      <w:bookmarkStart w:name="section0" w:id="1"/>
+      <w:r>
+        <w:t xml:space="preserve">Sommaire</w:t>
+      </w:r>
+      <w:bookmarkEnd w:id="1"/>
+    </w:p>
+    <w:p>
+      <w:pPr>
+        <w:pStyle w:val="ListParagraph"/>
+        <w:numPr>
+          <w:ilvl w:val="0"/>
+          <w:numId w:val="2"/>
+        </w:numPr>
+        <w:spacing w:after="80"/>
+      </w:pPr>
+      <w:hyperlink w:history="1" w:anchor="section1">
+        <w:r>
+          <w:rPr>
+            <w:color w:val="A8420C"/>
+            <w:u w:val="single"/>
+          </w:rPr>
+          <w:t xml:space="preserve">Installer l'application</w:t>
+        </w:r>
+      </w:hyperlink>
+    </w:p>
+    <w:p>
+      <w:pPr>
+        <w:pStyle w:val="ListParagraph"/>
+        <w:numPr>
+          <w:ilvl w:val="0"/>
+          <w:numId w:val="2"/>
+        </w:numPr>
+        <w:spacing w:after="80"/>
+      </w:pPr>
+      <w:hyperlink w:history="1" w:anchor="section2">
+        <w:r>
+          <w:rPr>
+            <w:color w:val="A8420C"/>
+            <w:u w:val="single"/>
+          </w:rPr>
+          <w:t xml:space="preserve">Première utilisation : préparer son club</w:t>
+        </w:r>
+      </w:hyperlink>
+    </w:p>
+    <w:p>
+      <w:pPr>
+        <w:pStyle w:val="ListParagraph"/>
+        <w:numPr>
+          <w:ilvl w:val="0"/>
+          <w:numId w:val="2"/>
+        </w:numPr>
+        <w:spacing w:after="80"/>
+      </w:pPr>
+      <w:hyperlink w:history="1" w:anchor="section3">
+        <w:r>
+          <w:rPr>
+            <w:color w:val="A8420C"/>
+            <w:u w:val="single"/>
+          </w:rPr>
+          <w:t xml:space="preserve">Préparer un match</w:t>
+        </w:r>
+      </w:hyperlink>
+    </w:p>
+    <w:p>
+      <w:pPr>
+        <w:pStyle w:val="ListParagraph"/>
+        <w:numPr>
+          <w:ilvl w:val="0"/>
+          <w:numId w:val="2"/>
+        </w:numPr>
+        <w:spacing w:after="80"/>
+      </w:pPr>
+      <w:hyperlink w:history="1" w:anchor="section4">
+        <w:r>
+          <w:rPr>
+            <w:color w:val="A8420C"/>
+            <w:u w:val="single"/>
+          </w:rPr>
+          <w:t xml:space="preserve">Tenir la table de marque</w:t>
+        </w:r>
+      </w:hyperlink>
+    </w:p>
+    <w:p>
+      <w:pPr>
+        <w:pStyle w:val="ListParagraph"/>
+        <w:numPr>
+          <w:ilvl w:val="0"/>
+          <w:numId w:val="2"/>
+        </w:numPr>
+        <w:spacing w:after="80"/>
+      </w:pPr>
+      <w:hyperlink w:history="1" w:anchor="section5">
+        <w:r>
+          <w:rPr>
+            <w:color w:val="A8420C"/>
+            <w:u w:val="single"/>
+          </w:rPr>
+          <w:t xml:space="preserve">Corriger une erreur : le journal</w:t>
+        </w:r>
+      </w:hyperlink>
+    </w:p>
+    <w:p>
+      <w:pPr>
+        <w:pStyle w:val="ListParagraph"/>
+        <w:numPr>
+          <w:ilvl w:val="0"/>
+          <w:numId w:val="2"/>
+        </w:numPr>
+        <w:spacing w:after="80"/>
+      </w:pPr>
+      <w:hyperlink w:history="1" w:anchor="section6">
+        <w:r>
+          <w:rPr>
+            <w:color w:val="A8420C"/>
+            <w:u w:val="single"/>
+          </w:rPr>
+          <w:t xml:space="preserve">Fin de période et fin de match</w:t>
+        </w:r>
+      </w:hyperlink>
+    </w:p>
+    <w:p>
+      <w:pPr>
+        <w:pStyle w:val="ListParagraph"/>
+        <w:numPr>
+          <w:ilvl w:val="0"/>
+          <w:numId w:val="2"/>
+        </w:numPr>
+        <w:spacing w:after="80"/>
+      </w:pPr>
+      <w:hyperlink w:history="1" w:anchor="section7">
+        <w:r>
+          <w:rPr>
+            <w:color w:val="A8420C"/>
+            <w:u w:val="single"/>
+          </w:rPr>
+          <w:t xml:space="preserve">Partager une équipe avant le match</w:t>
+        </w:r>
+      </w:hyperlink>
+    </w:p>
+    <w:p>
+      <w:pPr>
+        <w:pStyle w:val="ListParagraph"/>
+        <w:numPr>
+          <w:ilvl w:val="0"/>
+          <w:numId w:val="2"/>
+        </w:numPr>
+        <w:spacing w:after="80"/>
+      </w:pPr>
+      <w:hyperlink w:history="1" w:anchor="section8">
+        <w:r>
+          <w:rPr>
+            <w:color w:val="A8420C"/>
+            <w:u w:val="single"/>
+          </w:rPr>
+          <w:t xml:space="preserve">Mettre à jour les licenciés en cours de saison</w:t>
+        </w:r>
+      </w:hyperlink>
+    </w:p>
+    <w:p>
+      <w:pPr>
+        <w:pStyle w:val="ListParagraph"/>
+        <w:numPr>
+          <w:ilvl w:val="0"/>
+          <w:numId w:val="2"/>
+        </w:numPr>
+        <w:spacing w:after="80"/>
+      </w:pPr>
+      <w:hyperlink w:history="1" w:anchor="section9">
+        <w:r>
+          <w:rPr>
+            <w:color w:val="A8420C"/>
+            <w:u w:val="single"/>
+          </w:rPr>
+          <w:t xml:space="preserve">Bon à savoir</w:t>
+        </w:r>
+      </w:hyperlink>
+    </w:p>
+    <w:p>
+      <w:pPr>
+        <w:pStyle w:val="Heading1"/>
+        <w:tabs>
+          <w:tab w:val="left" w:pos="560"/>
+        </w:tabs>
+      </w:pPr>
+      <w:bookmarkStart w:name="section1" w:id="2"/>
+      <w:r>
+        <w:rPr>
+          <w:rFonts w:ascii="Manrope ExtraBold" w:cs="Manrope ExtraBold" w:eastAsia="Manrope ExtraBold" w:hAnsi="Manrope ExtraBold"/>
+          <w:color w:val="C24F12"/>
+        </w:rPr>
+        <w:t xml:space="preserve">1</w:t>
+      </w:r>
+      <w:r>
+        <w:t xml:space="preserve">	Installer l'application</w:t>
+      </w:r>
+      <w:bookmarkEnd w:id="2"/>
+    </w:p>
+    <w:p>
+      <w:pPr>
+        <w:spacing w:after="0" w:before="120"/>
+        <w:jc w:val="center"/>
+      </w:pPr>
+      <w:r>
+        <w:drawing>
+          <wp:inline distT="0" distB="0" distL="0" distR="0">
+            <wp:extent cx="1619250" cy="1619250"/>
+            <wp:effectExtent t="0" r="0" b="0" l="0"/>
+            <wp:docPr id="2" name="" descr="" title=""/>
+            <wp:cNvGraphicFramePr>
+              <a:graphicFrameLocks xmlns:a="http://schemas.openxmlformats.org/drawingml/2006/main" noChangeAspect="1"/>
+            </wp:cNvGraphicFramePr>
+            <a:graphic xmlns:a="http://schemas.openxmlformats.org/drawingml/2006/main">
+              <a:graphicData uri="http://schemas.openxmlformats.org/drawingml/2006/picture">
+                <pic:pic xmlns:pic="http://schemas.openxmlformats.org/drawingml/2006/picture">
+                  <pic:nvPicPr>
+                    <pic:cNvPr id="0" name="" descr=""/>
+                    <pic:cNvPicPr>
+                      <a:picLocks noChangeAspect="1" noChangeArrowheads="1"/>
+                    </pic:cNvPicPr>
+                  </pic:nvPicPr>
+                  <pic:blipFill>
+                    <a:blip r:embed="rId13" cstate="none"/>
+                    <a:srcRect/>
+                    <a:stretch>
+                      <a:fillRect/>
+                    </a:stretch>
+                  </pic:blipFill>
+                  <pic:spPr bwMode="auto">
+                    <a:xfrm>
+                      <a:off x="0" y="0"/>
                       <a:ext cx="1619250" cy="1619250"/>
                     </a:xfrm>
                     <a:prstGeom prst="rect">
@@ -460,7 +460,7 @@
         </w:rPr>
         <w:t xml:space="preserve">Adresse : </w:t>
       </w:r>
-      <w:hyperlink w:history="1" r:id="rIdxcykhuhewzchjrubddfjk">
+      <w:hyperlink w:history="1" r:id="rIdxbcl-oobs_zjymwtcx3oo">
         <w:r>
           <w:rPr>
             <w:b/>
@@ -1059,7 +1059,7 @@
         <w:t xml:space="preserve">Recommandé</w:t>
       </w:r>
       <w:r>
-        <w:t xml:space="preserve"> : importer l'export LigueAsso (tous les licenciés d'un coup) ;</w:t>
+        <w:t xml:space="preserve"> : importer l'export LiguAsso (tous les licenciés d'un coup) ;</w:t>
       </w:r>
     </w:p>
     <w:p>
@@ -1080,7 +1080,7 @@
         <w:pStyle w:val="Heading2"/>
       </w:pPr>
       <w:r>
-        <w:t xml:space="preserve">2.1 Récupérer l'export LigueAsso</w:t>
+        <w:t xml:space="preserve">2.1 Récupérer l'export LiguAsso</w:t>
       </w:r>
     </w:p>
     <w:p>
@@ -1101,7 +1101,7 @@
           <w:bCs/>
           <w:color w:val="A8420C"/>
         </w:rPr>
-        <w:t xml:space="preserve">LigueAsso</w:t>
+        <w:t xml:space="preserve">LiguAsso</w:t>
       </w:r>
       <w:r>
         <w:t xml:space="preserve"> avec le compte de l'association.</w:t>
@@ -1151,6 +1151,49 @@
       </w:r>
       <w:r>
         <w:t xml:space="preserve">.</w:t>
+      </w:r>
+    </w:p>
+    <w:p>
+      <w:pPr>
+        <w:spacing w:after="80"/>
+        <w:ind w:left="460"/>
+      </w:pPr>
+      <w:r>
+        <w:t xml:space="preserve">Si le menu ne s'ouvre pas (cas de Firefox), utilisez le lien direct : </w:t>
+      </w:r>
+      <w:hyperlink w:history="1" r:id="rIdixv5cg9qh27ewocprh87j">
+        <w:r>
+          <w:rPr>
+            <w:color w:val="A8420C"/>
+            <w:u w:val="single"/>
+          </w:rPr>
+          <w:t xml:space="preserve">Extraction adhérents sur LiguAsso</w:t>
+        </w:r>
+      </w:hyperlink>
+      <w:r>
+        <w:t xml:space="preserve">. Il est aussi proposé dans l'application, sur l'écran </w:t>
+      </w:r>
+      <w:r>
+        <w:rPr>
+          <w:b/>
+          <w:bCs/>
+          <w:color w:val="A8420C"/>
+        </w:rPr>
+        <w:t xml:space="preserve">Clubs et licenciés</w:t>
+      </w:r>
+      <w:r>
+        <w:t xml:space="preserve"> (bouton </w:t>
+      </w:r>
+      <w:r>
+        <w:rPr>
+          <w:b/>
+          <w:bCs/>
+          <w:color w:val="A8420C"/>
+        </w:rPr>
+        <w:t xml:space="preserve">Ouvrir l'extraction des adhérents</w:t>
+      </w:r>
+      <w:r>
+        <w:t xml:space="preserve">).</w:t>
       </w:r>
     </w:p>
     <w:p>
@@ -1739,7 +1782,7 @@
           <w:bCs/>
           <w:color w:val="A8420C"/>
         </w:rPr>
-        <w:t xml:space="preserve">Importer un export LigueAsso</w:t>
+        <w:t xml:space="preserve">Importer un export LiguAsso</w:t>
       </w:r>
       <w:r>
         <w:t xml:space="preserve"> et choisissez le fichier CSV.</w:t>
@@ -1934,7 +1977,7 @@
         <w:spacing w:after="140"/>
       </w:pPr>
       <w:r>
-        <w:t xml:space="preserve">Sans accès à LigueAsso :</w:t>
+        <w:t xml:space="preserve">Sans accès à LiguAsso :</w:t>
       </w:r>
     </w:p>
     <w:p>
@@ -2082,7 +2125,7 @@
                 <w:sz w:val="20"/>
                 <w:szCs w:val="20"/>
               </w:rPr>
-              <w:t xml:space="preserve">Vous pourrez importer un export LigueAsso plus tard : un club créé à la main n'ayant pas de n° d'association, l'import créera un second club. Supprimez alors le club saisi à la main.</w:t>
+              <w:t xml:space="preserve">Vous pourrez importer un export LiguAsso plus tard : un club créé à la main n'ayant pas de n° d'association, l'import créera un second club. Supprimez alors le club saisi à la main.</w:t>
             </w:r>
           </w:p>
         </w:tc>
@@ -5040,7 +5083,7 @@
         <w:spacing w:after="140"/>
       </w:pPr>
       <w:r>
-        <w:t xml:space="preserve">Refaites simplement un import (section 2.2) avec un export LigueAsso récent :</w:t>
+        <w:t xml:space="preserve">Refaites simplement un import (section 2.2) avec un export LiguAsso récent :</w:t>
       </w:r>
     </w:p>
     <w:p>
@@ -5294,7 +5337,7 @@
         <w:t xml:space="preserve">Mauvais fichier</w:t>
       </w:r>
       <w:r>
-        <w:t xml:space="preserve"> — Si l'export LigueAsso est donné par erreur à </w:t>
+        <w:t xml:space="preserve"> — Si l'export LiguAsso est donné par erreur à </w:t>
       </w:r>
       <w:r>
         <w:rPr>

</xml_diff>

<commit_message>
docs(clubs): Précision du type de sortie « Sortie simple Ufolep » pour l'export
Rappel du choix à faire dans le formulaire d'extraction des adhérents
LiguAsso, sur l'écran Clubs et licenciés et dans le guide (Word
régénéré).
</commit_message>
<xml_diff>
--- a/docs/guide-utilisation.docx
+++ b/docs/guide-utilisation.docx
@@ -182,7 +182,7 @@
       <w:pPr>
         <w:spacing w:before="80"/>
       </w:pPr>
-      <w:hyperlink w:history="1" r:id="rId_n6mjjkqs5ayl71_8a612">
+      <w:hyperlink w:history="1" r:id="rIdr1b7zvrhnz5uuf3cgraic">
         <w:r>
           <w:rPr>
             <w:color w:val="A8420C"/>
@@ -460,7 +460,7 @@
         </w:rPr>
         <w:t xml:space="preserve">Adresse : </w:t>
       </w:r>
-      <w:hyperlink w:history="1" r:id="rIdxbcl-oobs_zjymwtcx3oo">
+      <w:hyperlink w:history="1" r:id="rIdjumz2yjfuf5k98tfajxjz">
         <w:r>
           <w:rPr>
             <w:b/>
@@ -1161,7 +1161,7 @@
       <w:r>
         <w:t xml:space="preserve">Si le menu ne s'ouvre pas (cas de Firefox), utilisez le lien direct : </w:t>
       </w:r>
-      <w:hyperlink w:history="1" r:id="rIdixv5cg9qh27ewocprh87j">
+      <w:hyperlink w:history="1" r:id="rIdh9sql2lp9fbeuvtjrtfx9">
         <w:r>
           <w:rPr>
             <w:color w:val="A8420C"/>
@@ -1206,7 +1206,29 @@
         <w:spacing w:after="80"/>
       </w:pPr>
       <w:r>
-        <w:t xml:space="preserve">Exportez la liste des adhérents au format </w:t>
+        <w:t xml:space="preserve">Dans le formulaire, choisissez </w:t>
+      </w:r>
+      <w:r>
+        <w:rPr>
+          <w:b/>
+          <w:bCs/>
+          <w:color w:val="A8420C"/>
+        </w:rPr>
+        <w:t xml:space="preserve">Type de sortie</w:t>
+      </w:r>
+      <w:r>
+        <w:t xml:space="preserve"> : </w:t>
+      </w:r>
+      <w:r>
+        <w:rPr>
+          <w:b/>
+          <w:bCs/>
+          <w:color w:val="A8420C"/>
+        </w:rPr>
+        <w:t xml:space="preserve">Sortie simple Ufolep</w:t>
+      </w:r>
+      <w:r>
+        <w:t xml:space="preserve">, puis lancez l'export (fichier </w:t>
       </w:r>
       <w:r>
         <w:rPr>
@@ -1217,7 +1239,7 @@
         <w:t xml:space="preserve">CSV</w:t>
       </w:r>
       <w:r>
-        <w:t xml:space="preserve">.</w:t>
+        <w:t xml:space="preserve">).</w:t>
       </w:r>
     </w:p>
     <w:p>

</xml_diff>

<commit_message>
docs(feuille): Test de bout en bout, guide, README et renvoi de la spec parente vers la feuille PDF
</commit_message>
<xml_diff>
--- a/docs/guide-utilisation.docx
+++ b/docs/guide-utilisation.docx
@@ -182,7 +182,7 @@
       <w:pPr>
         <w:spacing w:before="80"/>
       </w:pPr>
-      <w:hyperlink w:history="1" r:id="rIdr1b7zvrhnz5uuf3cgraic">
+      <w:hyperlink w:history="1" r:id="rIdetgisb5wvphjunnfiwakc">
         <w:r>
           <w:rPr>
             <w:color w:val="A8420C"/>
@@ -460,7 +460,7 @@
         </w:rPr>
         <w:t xml:space="preserve">Adresse : </w:t>
       </w:r>
-      <w:hyperlink w:history="1" r:id="rIdjumz2yjfuf5k98tfajxjz">
+      <w:hyperlink w:history="1" r:id="rIdgul2wjfxdaht8kahnrkdi">
         <w:r>
           <w:rPr>
             <w:b/>
@@ -1161,7 +1161,7 @@
       <w:r>
         <w:t xml:space="preserve">Si le menu ne s'ouvre pas (cas de Firefox), utilisez le lien direct : </w:t>
       </w:r>
-      <w:hyperlink w:history="1" r:id="rIdh9sql2lp9fbeuvtjrtfx9">
+      <w:hyperlink w:history="1" r:id="rIdbpgbv1ioroztogsi901il">
         <w:r>
           <w:rPr>
             <w:color w:val="A8420C"/>
@@ -4681,7 +4681,183 @@
         <w:t xml:space="preserve">Match terminé</w:t>
       </w:r>
       <w:r>
-        <w:t xml:space="preserve"> affiche le score final.</w:t>
+        <w:t xml:space="preserve"> affiche le score final et permet d'envoyer la feuille de match.</w:t>
+      </w:r>
+    </w:p>
+    <w:p>
+      <w:pPr>
+        <w:pStyle w:val="Heading2"/>
+      </w:pPr>
+      <w:r>
+        <w:t xml:space="preserve">Officiels et capitaines</w:t>
+      </w:r>
+    </w:p>
+    <w:p>
+      <w:pPr>
+        <w:spacing w:after="140"/>
+      </w:pPr>
+      <w:r>
+        <w:t xml:space="preserve">Dépliez </w:t>
+      </w:r>
+      <w:r>
+        <w:rPr>
+          <w:b/>
+          <w:bCs/>
+          <w:color w:val="A8420C"/>
+        </w:rPr>
+        <w:t xml:space="preserve">Officiels et capitaines</w:t>
+      </w:r>
+      <w:r>
+        <w:t xml:space="preserve"> pour saisir le chronométreur, l'opérateur 30", le marqueur, l'arbitre, l'aide arbitre et les deux capitaines. Tout est facultatif : une case non remplie reste vide sur la feuille, à compléter au stylo si besoin. Chaque nom est enregistré dès que vous passez au champ suivant.</w:t>
+      </w:r>
+    </w:p>
+    <w:p>
+      <w:pPr>
+        <w:pStyle w:val="Heading2"/>
+      </w:pPr>
+      <w:r>
+        <w:t xml:space="preserve">Envoyer la feuille de match</w:t>
+      </w:r>
+    </w:p>
+    <w:p>
+      <w:pPr>
+        <w:pStyle w:val="ListParagraph"/>
+        <w:numPr>
+          <w:ilvl w:val="0"/>
+          <w:numId w:val="9"/>
+        </w:numPr>
+        <w:spacing w:after="80"/>
+      </w:pPr>
+      <w:r>
+        <w:t xml:space="preserve">Renseignez si vous le souhaitez l'</w:t>
+      </w:r>
+      <w:r>
+        <w:rPr>
+          <w:b/>
+          <w:bCs/>
+          <w:color w:val="A8420C"/>
+        </w:rPr>
+        <w:t xml:space="preserve">e-mail du coach adverse</w:t>
+      </w:r>
+      <w:r>
+        <w:t xml:space="preserve"> : il recevra la feuille en copie. Cette adresse n'est pas mémorisée.</w:t>
+      </w:r>
+    </w:p>
+    <w:p>
+      <w:pPr>
+        <w:pStyle w:val="ListParagraph"/>
+        <w:numPr>
+          <w:ilvl w:val="0"/>
+          <w:numId w:val="9"/>
+        </w:numPr>
+        <w:spacing w:after="80"/>
+      </w:pPr>
+      <w:r>
+        <w:t xml:space="preserve">Touchez </w:t>
+      </w:r>
+      <w:r>
+        <w:rPr>
+          <w:b/>
+          <w:bCs/>
+          <w:color w:val="A8420C"/>
+        </w:rPr>
+        <w:t xml:space="preserve">Enregistrer le PDF</w:t>
+      </w:r>
+      <w:r>
+        <w:t xml:space="preserve">. Sur téléphone ou tablette, le menu de partage s'ouvre : choisissez </w:t>
+      </w:r>
+      <w:r>
+        <w:rPr>
+          <w:b/>
+          <w:bCs/>
+          <w:color w:val="A8420C"/>
+        </w:rPr>
+        <w:t xml:space="preserve">Enregistrer dans Fichiers</w:t>
+      </w:r>
+      <w:r>
+        <w:t xml:space="preserve"> (ou directement </w:t>
+      </w:r>
+      <w:r>
+        <w:rPr>
+          <w:b/>
+          <w:bCs/>
+          <w:color w:val="A8420C"/>
+        </w:rPr>
+        <w:t xml:space="preserve">Mail</w:t>
+      </w:r>
+      <w:r>
+        <w:t xml:space="preserve">, la feuille est alors déjà jointe). Sur ordinateur, le fichier se télécharge. Il s'appelle par exemple </w:t>
+      </w:r>
+      <w:r>
+        <w:rPr>
+          <w:shd w:fill="EDECE7" w:color="auto" w:val="clear"/>
+        </w:rPr>
+        <w:t xml:space="preserve"> 2026-10-16_ST-DELPHIN-GRADIGNAN.pdf </w:t>
+      </w:r>
+      <w:r>
+        <w:t xml:space="preserve">.</w:t>
+      </w:r>
+    </w:p>
+    <w:p>
+      <w:pPr>
+        <w:pStyle w:val="ListParagraph"/>
+        <w:numPr>
+          <w:ilvl w:val="0"/>
+          <w:numId w:val="9"/>
+        </w:numPr>
+        <w:spacing w:after="80"/>
+      </w:pPr>
+      <w:r>
+        <w:t xml:space="preserve">Touchez </w:t>
+      </w:r>
+      <w:r>
+        <w:rPr>
+          <w:b/>
+          <w:bCs/>
+          <w:color w:val="A8420C"/>
+        </w:rPr>
+        <w:t xml:space="preserve">Préparer l'e-mail</w:t>
+      </w:r>
+      <w:r>
+        <w:t xml:space="preserve"> : votre messagerie s'ouvre avec le destinataire (</w:t>
+      </w:r>
+      <w:r>
+        <w:rPr>
+          <w:shd w:fill="EDECE7" w:color="auto" w:val="clear"/>
+        </w:rPr>
+        <w:t xml:space="preserve"> cd.33@ufolep.org </w:t>
+      </w:r>
+      <w:r>
+        <w:t xml:space="preserve">), le coach adverse en copie, l'objet et le texte déjà écrits.</w:t>
+      </w:r>
+    </w:p>
+    <w:p>
+      <w:pPr>
+        <w:pStyle w:val="ListParagraph"/>
+        <w:numPr>
+          <w:ilvl w:val="0"/>
+          <w:numId w:val="9"/>
+        </w:numPr>
+        <w:spacing w:after="80"/>
+      </w:pPr>
+      <w:r>
+        <w:rPr>
+          <w:b/>
+          <w:bCs/>
+          <w:color w:val="A8420C"/>
+        </w:rPr>
+        <w:t xml:space="preserve">Joignez le fichier PDF</w:t>
+      </w:r>
+      <w:r>
+        <w:t xml:space="preserve"> à l'e-mail, puis envoyez.</w:t>
+      </w:r>
+    </w:p>
+    <w:p>
+      <w:pPr>
+        <w:spacing w:after="140"/>
+      </w:pPr>
+      <w:r>
+        <w:t xml:space="preserve">La feuille tient sur une page : score, points par période, fautes d'équipe et temps morts, joueurs de chaque équipe avec leurs points et fautes, officiels, date et lieu.</w:t>
       </w:r>
     </w:p>
     <w:p>
@@ -4702,7 +4878,7 @@
         <w:t xml:space="preserve">Rouvrir pour corriger</w:t>
       </w:r>
       <w:r>
-        <w:t xml:space="preserve"> permet de revenir sur une erreur constatée après coup.</w:t>
+        <w:t xml:space="preserve"> permet de revenir sur une erreur constatée après coup ; regénérez ensuite la feuille.</w:t>
       </w:r>
     </w:p>
     <w:p>
@@ -4772,7 +4948,7 @@
         <w:pStyle w:val="ListParagraph"/>
         <w:numPr>
           <w:ilvl w:val="0"/>
-          <w:numId w:val="9"/>
+          <w:numId w:val="10"/>
         </w:numPr>
         <w:spacing w:after="80"/>
       </w:pPr>
@@ -4796,7 +4972,7 @@
         <w:pStyle w:val="ListParagraph"/>
         <w:numPr>
           <w:ilvl w:val="0"/>
-          <w:numId w:val="9"/>
+          <w:numId w:val="10"/>
         </w:numPr>
         <w:spacing w:after="80"/>
       </w:pPr>
@@ -4809,7 +4985,7 @@
         <w:pStyle w:val="ListParagraph"/>
         <w:numPr>
           <w:ilvl w:val="0"/>
-          <w:numId w:val="9"/>
+          <w:numId w:val="10"/>
         </w:numPr>
         <w:spacing w:after="80"/>
       </w:pPr>
@@ -4879,7 +5055,7 @@
         <w:pStyle w:val="ListParagraph"/>
         <w:numPr>
           <w:ilvl w:val="0"/>
-          <w:numId w:val="10"/>
+          <w:numId w:val="11"/>
         </w:numPr>
         <w:spacing w:after="80"/>
       </w:pPr>
@@ -4911,7 +5087,7 @@
         <w:pStyle w:val="ListParagraph"/>
         <w:numPr>
           <w:ilvl w:val="0"/>
-          <w:numId w:val="10"/>
+          <w:numId w:val="11"/>
         </w:numPr>
         <w:spacing w:after="80"/>
       </w:pPr>
@@ -4943,7 +5119,7 @@
         <w:pStyle w:val="ListParagraph"/>
         <w:numPr>
           <w:ilvl w:val="0"/>
-          <w:numId w:val="10"/>
+          <w:numId w:val="11"/>
         </w:numPr>
         <w:spacing w:after="80"/>
       </w:pPr>
@@ -5254,6 +5430,27 @@
       </w:r>
       <w:r>
         <w:t xml:space="preserve"> — Clubs, licenciés et matchs sont enregistrés uniquement sur l'appareil utilisé. Rien n'est envoyé sur internet. Effacer les données du navigateur ou désinstaller l'application supprime tout : utilisez de préférence toujours la même tablette pour la table de marque.</w:t>
+      </w:r>
+    </w:p>
+    <w:p>
+      <w:pPr>
+        <w:pStyle w:val="ListParagraph"/>
+        <w:numPr>
+          <w:ilvl w:val="0"/>
+          <w:numId w:val="3"/>
+        </w:numPr>
+        <w:spacing w:after="80"/>
+      </w:pPr>
+      <w:r>
+        <w:rPr>
+          <w:b/>
+          <w:bCs/>
+          <w:color w:val="A8420C"/>
+        </w:rPr>
+        <w:t xml:space="preserve">Feuille de match</w:t>
+      </w:r>
+      <w:r>
+        <w:t xml:space="preserve"> — Le PDF est fabriqué sur l'appareil, sans connexion. Rien n'est envoyé tant que vous n'envoyez pas vous-même l'e-mail.</w:t>
       </w:r>
     </w:p>
     <w:p>
@@ -6221,6 +6418,12 @@
     </w:lvlOverride>
   </w:num>
   <w:num w:numId="10">
+    <w:abstractNumId w:val="3"/>
+    <w:lvlOverride w:ilvl="0">
+      <w:startOverride w:val="1"/>
+    </w:lvlOverride>
+  </w:num>
+  <w:num w:numId="11">
     <w:abstractNumId w:val="3"/>
     <w:lvlOverride w:ilvl="0">
       <w:startOverride w:val="1"/>

</xml_diff>

<commit_message>
feat(preparation): Choix du lieu dans la liste des salles UFOLEP 33
Le champ texte « Lieu » devient un sélecteur proposant les 15 salles
des clubs du règlement 2025-2026, triées par nom de club, avec une
option « Autre lieu… » ouvrant une saisie libre. Le lieu reste
facultatif et enregistré sous la forme « Club — Salle, Ville ».

- Nouvelle liste `src/domain/lieux.ts` (club, salle, ville seulement,
  sans coordonnées de responsables) et fonction `libelleLieu`
- Guide d'utilisation et spec « lieu, mode libre » mis à jour
  (section 4 implémentée, sections 5 et 6 toujours reportées)
</commit_message>
<xml_diff>
--- a/docs/guide-utilisation.docx
+++ b/docs/guide-utilisation.docx
@@ -182,7 +182,7 @@
       <w:pPr>
         <w:spacing w:before="80"/>
       </w:pPr>
-      <w:hyperlink w:history="1" r:id="rIdetgisb5wvphjunnfiwakc">
+      <w:hyperlink w:history="1" r:id="rIdsg9aehubefmxm4pyqxqvg">
         <w:r>
           <w:rPr>
             <w:color w:val="A8420C"/>
@@ -460,7 +460,7 @@
         </w:rPr>
         <w:t xml:space="preserve">Adresse : </w:t>
       </w:r>
-      <w:hyperlink w:history="1" r:id="rIdgul2wjfxdaht8kahnrkdi">
+      <w:hyperlink w:history="1" r:id="rIdtvybpl4gmffnzp5kz2_zr">
         <w:r>
           <w:rPr>
             <w:b/>
@@ -1161,7 +1161,7 @@
       <w:r>
         <w:t xml:space="preserve">Si le menu ne s'ouvre pas (cas de Firefox), utilisez le lien direct : </w:t>
       </w:r>
-      <w:hyperlink w:history="1" r:id="rIdbpgbv1ioroztogsi901il">
+      <w:hyperlink w:history="1" r:id="rIdahdqffd5ugquupss35lb0">
         <w:r>
           <w:rPr>
             <w:color w:val="A8420C"/>
@@ -2283,7 +2283,7 @@
         <w:t xml:space="preserve">date</w:t>
       </w:r>
       <w:r>
-        <w:t xml:space="preserve"> (aujourd'hui par défaut) et indiquez le </w:t>
+        <w:t xml:space="preserve"> (aujourd'hui par défaut) et choisissez le </w:t>
       </w:r>
       <w:r>
         <w:rPr>
@@ -2294,7 +2294,18 @@
         <w:t xml:space="preserve">lieu</w:t>
       </w:r>
       <w:r>
-        <w:t xml:space="preserve">.</w:t>
+        <w:t xml:space="preserve"> dans la liste des salles des clubs UFOLEP 33. Pour une salle absente de la liste, prenez </w:t>
+      </w:r>
+      <w:r>
+        <w:rPr>
+          <w:b/>
+          <w:bCs/>
+          <w:color w:val="A8420C"/>
+        </w:rPr>
+        <w:t xml:space="preserve">Autre lieu…</w:t>
+      </w:r>
+      <w:r>
+        <w:t xml:space="preserve"> et saisissez-la. Le lieu reste facultatif.</w:t>
       </w:r>
     </w:p>
     <w:p>

</xml_diff>

<commit_message>
docs(guide): Régénération du guide Word et captures de présentation
- Guide Word régénéré : il citait encore « Copier le lien » et
  « Partager… », retirés du dialogue de partage.
- Officiels : enregistrement au fil de la saisie, et non plus au
  changement de champ.
- Script de captures de présentation (équipes fictives, score
  réaliste, tablette en paysage), lancé seulement à la demande.
</commit_message>
<xml_diff>
--- a/docs/guide-utilisation.docx
+++ b/docs/guide-utilisation.docx
@@ -182,7 +182,7 @@
       <w:pPr>
         <w:spacing w:before="80"/>
       </w:pPr>
-      <w:hyperlink w:history="1" r:id="rIdsg9aehubefmxm4pyqxqvg">
+      <w:hyperlink w:history="1" r:id="rIdrnwe7z4fprpc1ylq0tm88">
         <w:r>
           <w:rPr>
             <w:color w:val="A8420C"/>
@@ -460,7 +460,7 @@
         </w:rPr>
         <w:t xml:space="preserve">Adresse : </w:t>
       </w:r>
-      <w:hyperlink w:history="1" r:id="rIdtvybpl4gmffnzp5kz2_zr">
+      <w:hyperlink w:history="1" r:id="rIdpoli8s6indgecy-jtmnmj">
         <w:r>
           <w:rPr>
             <w:b/>
@@ -1161,7 +1161,7 @@
       <w:r>
         <w:t xml:space="preserve">Si le menu ne s'ouvre pas (cas de Firefox), utilisez le lien direct : </w:t>
       </w:r>
-      <w:hyperlink w:history="1" r:id="rIdahdqffd5ugquupss35lb0">
+      <w:hyperlink w:history="1" r:id="rIdgdcp_-kohjzybqqjwdary">
         <w:r>
           <w:rPr>
             <w:color w:val="A8420C"/>
@@ -4719,7 +4719,7 @@
         <w:t xml:space="preserve">Officiels et capitaines</w:t>
       </w:r>
       <w:r>
-        <w:t xml:space="preserve"> pour saisir le chronométreur, l'opérateur 30", le marqueur, l'arbitre, l'aide arbitre et les deux capitaines. Tout est facultatif : une case non remplie reste vide sur la feuille, à compléter au stylo si besoin. Chaque nom est enregistré dès que vous passez au champ suivant.</w:t>
+        <w:t xml:space="preserve"> pour saisir le chronométreur, l'opérateur 30", le marqueur, l'arbitre, l'aide arbitre et les deux capitaines. Tout est facultatif : une case non remplie reste vide sur la feuille, à compléter au stylo si besoin. Chaque nom est enregistré au fil de la saisie.</w:t>
       </w:r>
     </w:p>
     <w:p>
@@ -5020,32 +5020,10 @@
           <w:bCs/>
           <w:color w:val="A8420C"/>
         </w:rPr>
-        <w:t xml:space="preserve">Copier le lien</w:t>
-      </w:r>
-      <w:r>
-        <w:t xml:space="preserve">, </w:t>
-      </w:r>
-      <w:r>
-        <w:rPr>
-          <w:b/>
-          <w:bCs/>
-          <w:color w:val="A8420C"/>
-        </w:rPr>
         <w:t xml:space="preserve">Copier le code</w:t>
       </w:r>
       <w:r>
-        <w:t xml:space="preserve"> et </w:t>
-      </w:r>
-      <w:r>
-        <w:rPr>
-          <w:b/>
-          <w:bCs/>
-          <w:color w:val="A8420C"/>
-        </w:rPr>
-        <w:t xml:space="preserve">Partager…</w:t>
-      </w:r>
-      <w:r>
-        <w:t xml:space="preserve"> (SMS, messagerie…).</w:t>
+        <w:t xml:space="preserve"> pour l'envoyer par SMS ou messagerie.</w:t>
       </w:r>
     </w:p>
     <w:p>
@@ -5111,7 +5089,7 @@
         <w:t xml:space="preserve">Scanner le QR code</w:t>
       </w:r>
       <w:r>
-        <w:t xml:space="preserve">, ou collez le lien / le code reçu puis </w:t>
+        <w:t xml:space="preserve">, ou collez le code reçu puis </w:t>
       </w:r>
       <w:r>
         <w:rPr>
@@ -5154,7 +5132,7 @@
         <w:spacing w:after="140"/>
       </w:pPr>
       <w:r>
-        <w:t xml:space="preserve">Si le lien reçu par message est ouvert directement, l'application propose </w:t>
+        <w:t xml:space="preserve">Si le QR code est scanné avec l'appareil photo de la tablette plutôt que depuis l'application, il ouvre l'application qui propose </w:t>
       </w:r>
       <w:r>
         <w:rPr>
@@ -5222,7 +5200,7 @@
                 <w:sz w:val="20"/>
                 <w:szCs w:val="20"/>
               </w:rPr>
-              <w:t xml:space="preserve">Un lien peut s'ouvrir dans le navigateur plutôt que dans l'application installée. Dans ce cas, touchez </w:t>
+              <w:t xml:space="preserve">Le QR code peut s'ouvrir dans le navigateur plutôt que dans l'application installée. Dans ce cas, passez par </w:t>
             </w:r>
             <w:r>
               <w:rPr>
@@ -5232,14 +5210,14 @@
                 <w:sz w:val="20"/>
                 <w:szCs w:val="20"/>
               </w:rPr>
-              <w:t xml:space="preserve">Copier le code</w:t>
+              <w:t xml:space="preserve">Importer une équipe (QR / code)</w:t>
             </w:r>
             <w:r>
               <w:rPr>
                 <w:sz w:val="20"/>
                 <w:szCs w:val="20"/>
               </w:rPr>
-              <w:t xml:space="preserve"> puis collez-le dans l'application via </w:t>
+              <w:t xml:space="preserve"> → </w:t>
             </w:r>
             <w:r>
               <w:rPr>
@@ -5249,14 +5227,14 @@
                 <w:sz w:val="20"/>
                 <w:szCs w:val="20"/>
               </w:rPr>
-              <w:t xml:space="preserve">Importer une équipe (QR / code)</w:t>
+              <w:t xml:space="preserve">Scanner le QR code</w:t>
             </w:r>
             <w:r>
               <w:rPr>
                 <w:sz w:val="20"/>
                 <w:szCs w:val="20"/>
               </w:rPr>
-              <w:t xml:space="preserve">.</w:t>
+              <w:t xml:space="preserve"> dans l'application.</w:t>
             </w:r>
           </w:p>
         </w:tc>

</xml_diff>

<commit_message>
feat(feuille): Ajout d'un cadre d'observations et des signatures des capitaines
Le bas de la feuille PDF regroupe désormais les officiels sur trois
colonnes, un cadre d'observations vide et une case de signature par
capitaine, nom saisi en libellé. Le tout se complète à la main ou
dans un lecteur PDF, y compris après le match, et n'est jamais coupé
entre deux pages.
</commit_message>
<xml_diff>
--- a/docs/guide-utilisation.docx
+++ b/docs/guide-utilisation.docx
@@ -182,7 +182,7 @@
       <w:pPr>
         <w:spacing w:before="80"/>
       </w:pPr>
-      <w:hyperlink w:history="1" r:id="rIdrnwe7z4fprpc1ylq0tm88">
+      <w:hyperlink w:history="1" r:id="rIdf7e4clk66kw9bmgyoyhuw">
         <w:r>
           <w:rPr>
             <w:color w:val="A8420C"/>
@@ -460,7 +460,7 @@
         </w:rPr>
         <w:t xml:space="preserve">Adresse : </w:t>
       </w:r>
-      <w:hyperlink w:history="1" r:id="rIdpoli8s6indgecy-jtmnmj">
+      <w:hyperlink w:history="1" r:id="rIdjtn1jxpzhbbqdy4vk_oi1">
         <w:r>
           <w:rPr>
             <w:b/>
@@ -1161,7 +1161,7 @@
       <w:r>
         <w:t xml:space="preserve">Si le menu ne s'ouvre pas (cas de Firefox), utilisez le lien direct : </w:t>
       </w:r>
-      <w:hyperlink w:history="1" r:id="rIdgdcp_-kohjzybqqjwdary">
+      <w:hyperlink w:history="1" r:id="rIdw1z0phk93zaowrnkj1b9s">
         <w:r>
           <w:rPr>
             <w:color w:val="A8420C"/>
@@ -4868,7 +4868,18 @@
         <w:spacing w:after="140"/>
       </w:pPr>
       <w:r>
-        <w:t xml:space="preserve">La feuille tient sur une page : score, points par période, fautes d'équipe et temps morts, joueurs de chaque équipe avec leurs points et fautes, officiels, date et lieu.</w:t>
+        <w:t xml:space="preserve">La feuille tient sur une page : score, points par période, fautes d'équipe et temps morts, joueurs de chaque équipe avec leurs points et fautes, officiels, date et lieu. En bas, un cadre </w:t>
+      </w:r>
+      <w:r>
+        <w:rPr>
+          <w:b/>
+          <w:bCs/>
+          <w:color w:val="A8420C"/>
+        </w:rPr>
+        <w:t xml:space="preserve">Observations</w:t>
+      </w:r>
+      <w:r>
+        <w:t xml:space="preserve"> et une case de signature par capitaine restent vides : ils se remplissent à la main sur la feuille imprimée ou dans un lecteur PDF, y compris plusieurs jours après le match (par exemple quand l'assurance d'un joueur blessé demande la feuille signée).</w:t>
       </w:r>
     </w:p>
     <w:p>

</xml_diff>